<commit_message>
Confirm co-author conflict-of-interest declaration
Silas Abutu and Abidemi Orimogunje have now directly confirmed they
have no funding source or other conflicting interest relevant to this
manuscript. Removes the placeholder bracket from
conflict_of_interest_statement.docx that flagged this as still
needing their confirmation, and states plainly that all three authors
confirmed it directly. Rebuilt and visually verified. (cover_letter.docx
is also regenerated by the same build script and re-committed, though
its content is unchanged.)

Co-Authored-By: Claude Sonnet 5 <noreply@anthropic.com>
Claude-Session: https://claude.ai/code/session_01STXEQUrz8Ura7T4i7Zm8NB
</commit_message>
<xml_diff>
--- a/manuscript/conflict_of_interest_statement.docx
+++ b/manuscript/conflict_of_interest_statement.docx
@@ -89,25 +89,7 @@
           <w:sz w:val="24"/>
           <w:szCs w:val="24"/>
         </w:rPr>
-        <w:t xml:space="preserve">The authors declare that they have no known competing financial interests, personal relationships, or institutional affiliations that could have appeared to influence the work reported in this paper. No funding, grant, or other financial support was received for this research.</w:t>
-      </w:r>
-    </w:p>
-    <w:p>
-      <w:pPr>
-        <w:spacing w:after="200" w:line="360"/>
-        <w:jc w:val="both"/>
-      </w:pPr>
-      <w:r>
-        <w:rPr>
-          <w:rFonts w:ascii="Times New Roman" w:cs="Times New Roman" w:eastAsia="Times New Roman" w:hAnsi="Times New Roman"/>
-          <w:b w:val="false"/>
-          <w:bCs w:val="false"/>
-          <w:i/>
-          <w:iCs/>
-          <w:sz w:val="24"/>
-          <w:szCs w:val="24"/>
-        </w:rPr>
-        <w:t xml:space="preserve">[PLACEHOLDER — confirm before submission: this statement is drafted on behalf of all three authors (Friday Ogochukwu Ikwuogu, Silas Abutu, Abidemi Orimogunje) based on the information available at build time. A conflict-of-interest and funding declaration is a factual attestation made on every co-author's behalf, not just the corresponding author's — please confirm directly with Mr. Abutu and Mr. Orimogunje that neither has a funding source, employer relationship, or other interest relevant to this manuscript before this statement is submitted. Remove this bracketed note once confirmed.]</w:t>
+        <w:t xml:space="preserve">The authors declare that they have no known competing financial interests, personal relationships, or institutional affiliations that could have appeared to influence the work reported in this paper. No funding, grant, or other financial support was received for this research. This has been confirmed directly by all three authors, including co-authors Silas Abutu and Abidemi Orimogunje.</w:t>
       </w:r>
     </w:p>
     <w:p>

</xml_diff>